<commit_message>
Use explicit UTF-8 for Windows sources and generated documents
</commit_message>
<xml_diff>
--- a/docs/验收成果/项目申报书草稿.docx
+++ b/docs/验收成果/项目申报书草稿.docx
@@ -1212,9 +1212,6 @@
     <w:qFormat/>
     <w:rsid w:val="00FC693F"/>
     <w:pPr>
-      <w:pBdr>
-        <w:bottom w:val="single" w:sz="8" w:space="4" w:color="4F81BD" w:themeColor="accent1"/>
-      </w:pBdr>
       <w:spacing w:after="300" w:line="240" w:lineRule="auto"/>
       <w:contextualSpacing/>
     </w:pPr>
@@ -1702,9 +1699,6 @@
     <w:qFormat/>
     <w:rsid w:val="00FC693F"/>
     <w:pPr>
-      <w:pBdr>
-        <w:bottom w:val="single" w:sz="4" w:space="4" w:color="4F81BD" w:themeColor="accent1"/>
-      </w:pBdr>
       <w:spacing w:before="200" w:after="280"/>
       <w:ind w:left="936" w:right="936"/>
     </w:pPr>

</xml_diff>